<commit_message>
Zoom link for today's class; Draft Conference covers Oct 21 and 22, one-page cover page
Co-Authored-By: Claude Opus 5.5 <noreply@anthropic.com>
</commit_message>
<xml_diff>
--- a/week-09-metaphor-and-leads/Draft Conference.docx
+++ b/week-09-metaphor-and-leads/Draft Conference.docx
@@ -73,7 +73,7 @@
           <w:sz w:val="22"/>
           <w:szCs w:val="22"/>
         </w:rPr>
-        <w:t>Before your draft conference on Wednesday, October 21, you post your revised draft so I can read it before we meet over Zoom. This is my read of your currere — after you have already heard it aloud, traded peer feedback, and revised. Come ready to talk about the one or two things you most want to work on. Book your slot here: https://calendar.app.google/jrNdwi2coGVSG6F6A</w:t>
+        <w:t>Before your draft conference on Wednesday, October 21 or Thursday, October 22, you post your revised draft so I can read it before we meet over Zoom. This is my read of your currere — after you have already heard it aloud, traded peer feedback, and revised. Come ready to talk about the one or two things you most want to work on. Book your slot here: https://calendar.app.google/jrNdwi2coGVSG6F6A</w:t>
       </w:r>
     </w:p>
     <w:p>
@@ -140,7 +140,7 @@
           <w:sz w:val="22"/>
           <w:szCs w:val="22"/>
         </w:rPr>
-        <w:t>A one-paragraph cover page.</w:t>
+        <w:t>A one-page cover page.</w:t>
       </w:r>
       <w:r>
         <w:rPr>

</xml_diff>